<commit_message>
Sync repo from tenant
</commit_message>
<xml_diff>
--- a/cpi-artifacts/Practice/Calling_other_iflow_using_http_adapter/src/main/resources/scenarioflows/integrationflow/docs/Calling_Documentation.docx
+++ b/cpi-artifacts/Practice/Calling_other_iflow_using_http_adapter/src/main/resources/scenarioflows/integrationflow/docs/Calling_Documentation.docx
@@ -2,43 +2,37 @@
 <file path=word/document.xml><?xml version="1.0" encoding="utf-8"?>
 <w:document xmlns:w="http://schemas.openxmlformats.org/wordprocessingml/2006/main" xmlns:m="http://schemas.openxmlformats.org/officeDocument/2006/math" xmlns:r="http://schemas.openxmlformats.org/officeDocument/2006/relationships" xmlns:o="urn:schemas-microsoft-com:office:office" xmlns:v="urn:schemas-microsoft-com:vml" xmlns:w10="urn:schemas-microsoft-com:office:word" xmlns:a="http://schemas.openxmlformats.org/drawingml/2006/main" xmlns:pic="http://schemas.openxmlformats.org/drawingml/2006/picture" xmlns:wp="http://schemas.openxmlformats.org/drawingml/2006/wordprocessingDrawing">
   <w:body>
+    <w:bookmarkStart w:id="30" w:name="X1b4aa383f316f3cc9f840ebad19a2118950ad0e"/>
+    <w:p>
+      <w:pPr>
+        <w:pStyle w:val="Heading1"/>
+      </w:pPr>
+      <w:r>
+        <w:t xml:space="preserve">Consolidated Technical Report for SAP CPI iFlow: Calling</w:t>
+      </w:r>
+    </w:p>
+    <w:bookmarkStart w:id="20" w:name="high-level-architecture"/>
+    <w:p>
+      <w:pPr>
+        <w:pStyle w:val="Heading2"/>
+      </w:pPr>
+      <w:r>
+        <w:t xml:space="preserve">1. High-level architecture</w:t>
+      </w:r>
+    </w:p>
     <w:p>
       <w:pPr>
         <w:pStyle w:val="FirstParagraph"/>
       </w:pPr>
       <w:r>
-        <w:t xml:space="preserve">Here’s the Strictly EXACT template for your Consolidated Technical Report for SAP CPI iFlow: Calling:</w:t>
-      </w:r>
-    </w:p>
-    <w:p>
-      <w:r>
-        <w:pict>
-          <v:rect style="width:0;height:1.5pt" o:hralign="center" o:hrstd="t" o:hr="t"/>
-        </w:pict>
-      </w:r>
-    </w:p>
-    <w:bookmarkStart w:id="20" w:name="high-level-architecture"/>
-    <w:p>
-      <w:pPr>
-        <w:pStyle w:val="Heading3"/>
-      </w:pPr>
-      <w:r>
-        <w:t xml:space="preserve">1. High-level architecture</w:t>
-      </w:r>
-    </w:p>
-    <w:p>
-      <w:pPr>
-        <w:pStyle w:val="FirstParagraph"/>
-      </w:pPr>
-      <w:r>
-        <w:t xml:space="preserve">Sender systems use HTTP adapters to connect to the processor via ports, while receiver systems accept requests through a specific URL using the same adapter.</w:t>
+        <w:t xml:space="preserve">This high-level architecture is designed to manage HTTP calls between sender and receiver systems using adapters. The sender system sends the request through an HTTP adapter, which processes the message internally and returns it to the receiver system. Both systems use a standard HTTP adapter (e.g., curl or Python’s requests library) for communication.</w:t>
       </w:r>
     </w:p>
     <w:bookmarkEnd w:id="20"/>
     <w:bookmarkStart w:id="21" w:name="purpose-of-this-iflow"/>
     <w:p>
       <w:pPr>
-        <w:pStyle w:val="Heading3"/>
+        <w:pStyle w:val="Heading2"/>
       </w:pPr>
       <w:r>
         <w:t xml:space="preserve">2. Purpose of this iFlow</w:t>
@@ -49,14 +43,14 @@
         <w:pStyle w:val="FirstParagraph"/>
       </w:pPr>
       <w:r>
-        <w:t xml:space="preserve">This iFlow is designed for secure data exchange with robust testing involving SQL injection attackers.</w:t>
+        <w:t xml:space="preserve">This iFlow is designed to enable communication between two main providers using HTTP endpoints via adapters, allowing seamless integration and processing of messages.</w:t>
       </w:r>
     </w:p>
     <w:bookmarkEnd w:id="21"/>
     <w:bookmarkStart w:id="22" w:name="senderreceiver-systems"/>
     <w:p>
       <w:pPr>
-        <w:pStyle w:val="Heading3"/>
+        <w:pStyle w:val="Heading2"/>
       </w:pPr>
       <w:r>
         <w:t xml:space="preserve">3. Sender/Receiver systems</w:t>
@@ -75,10 +69,13 @@
           <w:bCs/>
           <w:b/>
         </w:rPr>
-        <w:t xml:space="preserve">Sender Systems</w:t>
-      </w:r>
-      <w:r>
-        <w:t xml:space="preserve">: HTTP server on port 80 and HTTP attacker.</w:t>
+        <w:t xml:space="preserve">Sender System</w:t>
+      </w:r>
+      <w:r>
+        <w:t xml:space="preserve">: sender-system-xslmap</w:t>
+      </w:r>
+      <w:r>
+        <w:br/>
       </w:r>
     </w:p>
     <w:p>
@@ -94,17 +91,17 @@
           <w:bCs/>
           <w:b/>
         </w:rPr>
-        <w:t xml:space="preserve">Receiver Systems</w:t>
-      </w:r>
-      <w:r>
-        <w:t xml:space="preserve">: Accepting requests via a URL using the same adapter.</w:t>
+        <w:t xml:space="preserve">Receiver System</w:t>
+      </w:r>
+      <w:r>
+        <w:t xml:space="preserve">: receiver-system-xslmap</w:t>
       </w:r>
     </w:p>
     <w:bookmarkEnd w:id="22"/>
     <w:bookmarkStart w:id="23" w:name="adapter-types-used"/>
     <w:p>
       <w:pPr>
-        <w:pStyle w:val="Heading3"/>
+        <w:pStyle w:val="Heading2"/>
       </w:pPr>
       <w:r>
         <w:t xml:space="preserve">4. Adapter types used</w:t>
@@ -115,17 +112,101 @@
         <w:pStyle w:val="FirstParagraph"/>
       </w:pPr>
       <w:r>
-        <w:t xml:space="preserve">HTTP adapter and SQL injection attacker.</w:t>
+        <w:t xml:space="preserve">[]</w:t>
       </w:r>
     </w:p>
     <w:bookmarkEnd w:id="23"/>
     <w:bookmarkStart w:id="24" w:name="step-by-step-flow-explanation"/>
     <w:p>
       <w:pPr>
-        <w:pStyle w:val="Heading3"/>
+        <w:pStyle w:val="Heading2"/>
       </w:pPr>
       <w:r>
         <w:t xml:space="preserve">5. Step-by-step flow explanation</w:t>
+      </w:r>
+    </w:p>
+    <w:p>
+      <w:pPr>
+        <w:pStyle w:val="FirstParagraph"/>
+      </w:pPr>
+      <w:r>
+        <w:t xml:space="preserve">The end-to-end step-by-step process is as follows:</w:t>
+      </w:r>
+      <w:r>
+        <w:br/>
+      </w:r>
+      <w:r>
+        <w:t xml:space="preserve">1. Begin processing the request in the xslmap processor.</w:t>
+      </w:r>
+      <w:r>
+        <w:br/>
+      </w:r>
+      <w:r>
+        <w:t xml:space="preserve">2. Map the XSLT template data to the sender system and message fields.</w:t>
+      </w:r>
+      <w:r>
+        <w:br/>
+      </w:r>
+      <w:r>
+        <w:t xml:space="preserve">3. Process the received message within the target system.</w:t>
+      </w:r>
+      <w:r>
+        <w:br/>
+      </w:r>
+      <w:r>
+        <w:t xml:space="preserve">4. Send the processed response back through an HTTP adapter to the receiver system.</w:t>
+      </w:r>
+    </w:p>
+    <w:bookmarkEnd w:id="24"/>
+    <w:bookmarkStart w:id="25" w:name="mapping-logic-summary"/>
+    <w:p>
+      <w:pPr>
+        <w:pStyle w:val="Heading2"/>
+      </w:pPr>
+      <w:r>
+        <w:t xml:space="preserve">6. Mapping logic summary</w:t>
+      </w:r>
+    </w:p>
+    <w:p>
+      <w:pPr>
+        <w:pStyle w:val="FirstParagraph"/>
+      </w:pPr>
+      <w:r>
+        <w:t xml:space="preserve">The mapping process uses an XSLT processor that maps the template data into the iFlow structure, with columns A-D holding sender system ID, B-C representing message fields, D denoting the request method, and E indicating the endpoint name.</w:t>
+      </w:r>
+    </w:p>
+    <w:bookmarkEnd w:id="25"/>
+    <w:bookmarkStart w:id="26" w:name="groovy-script-explanations"/>
+    <w:p>
+      <w:pPr>
+        <w:pStyle w:val="Heading2"/>
+      </w:pPr>
+      <w:r>
+        <w:t xml:space="preserve">7. Groovy script explanations</w:t>
+      </w:r>
+    </w:p>
+    <w:p>
+      <w:pPr>
+        <w:pStyle w:val="FirstParagraph"/>
+      </w:pPr>
+      <w:r>
+        <w:t xml:space="preserve">Scripts detected: []</w:t>
+      </w:r>
+      <w:r>
+        <w:br/>
+      </w:r>
+      <w:r>
+        <w:t xml:space="preserve">&lt;Explain each script’s purpose.&gt;</w:t>
+      </w:r>
+    </w:p>
+    <w:bookmarkEnd w:id="26"/>
+    <w:bookmarkStart w:id="27" w:name="error-handling"/>
+    <w:p>
+      <w:pPr>
+        <w:pStyle w:val="Heading2"/>
+      </w:pPr>
+      <w:r>
+        <w:t xml:space="preserve">8. Error handling</w:t>
       </w:r>
     </w:p>
     <w:p>
@@ -137,7 +218,17 @@
         <w:pStyle w:val="Compact"/>
       </w:pPr>
       <w:r>
-        <w:t xml:space="preserve">Send request to sender: Authentication occurs, then data is processed by the processor.</w:t>
+        <w:rPr>
+          <w:bCs/>
+          <w:b/>
+        </w:rPr>
+        <w:t xml:space="preserve">XML parse error</w:t>
+      </w:r>
+      <w:r>
+        <w:t xml:space="preserve">: If the source file is missing or invalid, use a custom error handler.</w:t>
+      </w:r>
+      <w:r>
+        <w:br/>
       </w:r>
     </w:p>
     <w:p>
@@ -149,7 +240,17 @@
         <w:pStyle w:val="Compact"/>
       </w:pPr>
       <w:r>
-        <w:t xml:space="preserve">Process data in processor.</w:t>
+        <w:rPr>
+          <w:bCs/>
+          <w:b/>
+        </w:rPr>
+        <w:t xml:space="preserve">Network issue</w:t>
+      </w:r>
+      <w:r>
+        <w:t xml:space="preserve">: Handle exceptions during HTTP communication and log errors with the server.</w:t>
+      </w:r>
+      <w:r>
+        <w:br/>
       </w:r>
     </w:p>
     <w:p>
@@ -161,7 +262,17 @@
         <w:pStyle w:val="Compact"/>
       </w:pPr>
       <w:r>
-        <w:t xml:space="preserve">Validate output for security concerns.</w:t>
+        <w:rPr>
+          <w:bCs/>
+          <w:b/>
+        </w:rPr>
+        <w:t xml:space="preserve">Invalid request</w:t>
+      </w:r>
+      <w:r>
+        <w:t xml:space="preserve">: Use exception handling to process responses as XML and display an error message.</w:t>
+      </w:r>
+      <w:r>
+        <w:br/>
       </w:r>
     </w:p>
     <w:p>
@@ -173,855 +284,63 @@
         <w:pStyle w:val="Compact"/>
       </w:pPr>
       <w:r>
-        <w:t xml:space="preserve">Output result to receiver system via URL.</w:t>
-      </w:r>
-    </w:p>
-    <w:bookmarkEnd w:id="24"/>
-    <w:bookmarkStart w:id="25" w:name="mapping-logic-summary"/>
-    <w:p>
-      <w:pPr>
-        <w:pStyle w:val="Heading3"/>
-      </w:pPr>
-      <w:r>
-        <w:t xml:space="preserve">6. Mapping logic summary</w:t>
-      </w:r>
-    </w:p>
-    <w:p>
-      <w:pPr>
-        <w:numPr>
-          <w:ilvl w:val="0"/>
-          <w:numId w:val="1003"/>
-        </w:numPr>
-        <w:pStyle w:val="Compact"/>
-      </w:pPr>
-      <w:r>
-        <w:t xml:space="preserve">XSLT transformations map sender data to processor format.</w:t>
-      </w:r>
-    </w:p>
-    <w:p>
-      <w:pPr>
-        <w:numPr>
-          <w:ilvl w:val="0"/>
-          <w:numId w:val="1003"/>
-        </w:numPr>
-        <w:pStyle w:val="Compact"/>
-      </w:pPr>
-      <w:r>
-        <w:t xml:space="preserve">Message mapping between sender and receiver systems.</w:t>
-      </w:r>
-    </w:p>
-    <w:bookmarkEnd w:id="25"/>
-    <w:bookmarkStart w:id="26" w:name="groovy-script-explanations"/>
-    <w:p>
-      <w:pPr>
-        <w:pStyle w:val="Heading3"/>
-      </w:pPr>
-      <w:r>
-        <w:t xml:space="preserve">7. Groovy script explanations</w:t>
-      </w:r>
-    </w:p>
-    <w:p>
-      <w:pPr>
-        <w:pStyle w:val="SourceCode"/>
-      </w:pPr>
-      <w:r>
         <w:rPr>
-          <w:rStyle w:val="CommentTok"/>
+          <w:bCs/>
+          <w:b/>
         </w:rPr>
-        <w:t xml:space="preserve">// Send request</w:t>
-      </w:r>
-      <w:r>
-        <w:br/>
-      </w:r>
-      <w:r>
-        <w:rPr>
-          <w:rStyle w:val="KeywordTok"/>
-        </w:rPr>
-        <w:t xml:space="preserve">class</w:t>
-      </w:r>
-      <w:r>
-        <w:rPr>
-          <w:rStyle w:val="NormalTok"/>
-        </w:rPr>
-        <w:t xml:space="preserve"> SendRequest </w:t>
-      </w:r>
-      <w:r>
-        <w:rPr>
-          <w:rStyle w:val="OperatorTok"/>
-        </w:rPr>
-        <w:t xml:space="preserve">{</w:t>
-      </w:r>
-      <w:r>
-        <w:br/>
-      </w:r>
-      <w:r>
-        <w:rPr>
-          <w:rStyle w:val="NormalTok"/>
-        </w:rPr>
-        <w:t xml:space="preserve">    </w:t>
-      </w:r>
-      <w:r>
-        <w:rPr>
-          <w:rStyle w:val="DataTypeTok"/>
-        </w:rPr>
-        <w:t xml:space="preserve">void</w:t>
-      </w:r>
-      <w:r>
-        <w:rPr>
-          <w:rStyle w:val="NormalTok"/>
-        </w:rPr>
-        <w:t xml:space="preserve"> </w:t>
-      </w:r>
-      <w:r>
-        <w:rPr>
-          <w:rStyle w:val="FunctionTok"/>
-        </w:rPr>
-        <w:t xml:space="preserve">main</w:t>
-      </w:r>
-      <w:r>
-        <w:rPr>
-          <w:rStyle w:val="OperatorTok"/>
-        </w:rPr>
-        <w:t xml:space="preserve">(</w:t>
-      </w:r>
-      <w:r>
-        <w:rPr>
-          <w:rStyle w:val="BuiltInTok"/>
-        </w:rPr>
-        <w:t xml:space="preserve">String</w:t>
-      </w:r>
-      <w:r>
-        <w:rPr>
-          <w:rStyle w:val="OperatorTok"/>
-        </w:rPr>
-        <w:t xml:space="preserve">[]</w:t>
-      </w:r>
-      <w:r>
-        <w:rPr>
-          <w:rStyle w:val="NormalTok"/>
-        </w:rPr>
-        <w:t xml:space="preserve"> args</w:t>
-      </w:r>
-      <w:r>
-        <w:rPr>
-          <w:rStyle w:val="OperatorTok"/>
-        </w:rPr>
-        <w:t xml:space="preserve">)</w:t>
-      </w:r>
-      <w:r>
-        <w:rPr>
-          <w:rStyle w:val="NormalTok"/>
-        </w:rPr>
-        <w:t xml:space="preserve"> </w:t>
-      </w:r>
-      <w:r>
-        <w:rPr>
-          <w:rStyle w:val="OperatorTok"/>
-        </w:rPr>
-        <w:t xml:space="preserve">{</w:t>
-      </w:r>
-      <w:r>
-        <w:br/>
-      </w:r>
-      <w:r>
-        <w:rPr>
-          <w:rStyle w:val="NormalTok"/>
-        </w:rPr>
-        <w:t xml:space="preserve">        </w:t>
-      </w:r>
-      <w:r>
-        <w:rPr>
-          <w:rStyle w:val="CommentTok"/>
-        </w:rPr>
-        <w:t xml:space="preserve">// Send HTTP request to processor</w:t>
-      </w:r>
-      <w:r>
-        <w:br/>
-      </w:r>
-      <w:r>
-        <w:rPr>
-          <w:rStyle w:val="NormalTok"/>
-        </w:rPr>
-        <w:t xml:space="preserve">        </w:t>
-      </w:r>
-      <w:r>
-        <w:rPr>
-          <w:rStyle w:val="KeywordTok"/>
-        </w:rPr>
-        <w:t xml:space="preserve">this</w:t>
-      </w:r>
-      <w:r>
-        <w:rPr>
-          <w:rStyle w:val="OperatorTok"/>
-        </w:rPr>
-        <w:t xml:space="preserve">.</w:t>
-      </w:r>
-      <w:r>
-        <w:rPr>
-          <w:rStyle w:val="FunctionTok"/>
-        </w:rPr>
-        <w:t xml:space="preserve">sendTo</w:t>
-      </w:r>
-      <w:r>
-        <w:rPr>
-          <w:rStyle w:val="OperatorTok"/>
-        </w:rPr>
-        <w:t xml:space="preserve">(</w:t>
-      </w:r>
-      <w:r>
-        <w:rPr>
-          <w:rStyle w:val="StringTok"/>
-        </w:rPr>
-        <w:t xml:space="preserve">"http://example.com:80"</w:t>
-      </w:r>
-      <w:r>
-        <w:rPr>
-          <w:rStyle w:val="OperatorTok"/>
-        </w:rPr>
-        <w:t xml:space="preserve">);</w:t>
-      </w:r>
-      <w:r>
-        <w:br/>
-      </w:r>
-      <w:r>
-        <w:rPr>
-          <w:rStyle w:val="NormalTok"/>
-        </w:rPr>
-        <w:t xml:space="preserve">    </w:t>
-      </w:r>
-      <w:r>
-        <w:rPr>
-          <w:rStyle w:val="OperatorTok"/>
-        </w:rPr>
-        <w:t xml:space="preserve">}</w:t>
-      </w:r>
-      <w:r>
-        <w:br/>
-      </w:r>
-      <w:r>
-        <w:rPr>
-          <w:rStyle w:val="OperatorTok"/>
-        </w:rPr>
-        <w:t xml:space="preserve">}</w:t>
-      </w:r>
-      <w:r>
-        <w:br/>
-      </w:r>
-      <w:r>
-        <w:br/>
-      </w:r>
-      <w:r>
-        <w:rPr>
-          <w:rStyle w:val="CommentTok"/>
-        </w:rPr>
-        <w:t xml:space="preserve">// Process result</w:t>
-      </w:r>
-      <w:r>
-        <w:br/>
-      </w:r>
-      <w:r>
-        <w:rPr>
-          <w:rStyle w:val="KeywordTok"/>
-        </w:rPr>
-        <w:t xml:space="preserve">class</w:t>
-      </w:r>
-      <w:r>
-        <w:rPr>
-          <w:rStyle w:val="NormalTok"/>
-        </w:rPr>
-        <w:t xml:space="preserve"> ProcessResult </w:t>
-      </w:r>
-      <w:r>
-        <w:rPr>
-          <w:rStyle w:val="OperatorTok"/>
-        </w:rPr>
-        <w:t xml:space="preserve">{</w:t>
-      </w:r>
-      <w:r>
-        <w:br/>
-      </w:r>
-      <w:r>
-        <w:rPr>
-          <w:rStyle w:val="NormalTok"/>
-        </w:rPr>
-        <w:t xml:space="preserve">    </w:t>
-      </w:r>
-      <w:r>
-        <w:rPr>
-          <w:rStyle w:val="DataTypeTok"/>
-        </w:rPr>
-        <w:t xml:space="preserve">void</w:t>
-      </w:r>
-      <w:r>
-        <w:rPr>
-          <w:rStyle w:val="NormalTok"/>
-        </w:rPr>
-        <w:t xml:space="preserve"> </w:t>
-      </w:r>
-      <w:r>
-        <w:rPr>
-          <w:rStyle w:val="FunctionTok"/>
-        </w:rPr>
-        <w:t xml:space="preserve">main</w:t>
-      </w:r>
-      <w:r>
-        <w:rPr>
-          <w:rStyle w:val="OperatorTok"/>
-        </w:rPr>
-        <w:t xml:space="preserve">(</w:t>
-      </w:r>
-      <w:r>
-        <w:rPr>
-          <w:rStyle w:val="BuiltInTok"/>
-        </w:rPr>
-        <w:t xml:space="preserve">String</w:t>
-      </w:r>
-      <w:r>
-        <w:rPr>
-          <w:rStyle w:val="OperatorTok"/>
-        </w:rPr>
-        <w:t xml:space="preserve">[]</w:t>
-      </w:r>
-      <w:r>
-        <w:rPr>
-          <w:rStyle w:val="NormalTok"/>
-        </w:rPr>
-        <w:t xml:space="preserve"> args</w:t>
-      </w:r>
-      <w:r>
-        <w:rPr>
-          <w:rStyle w:val="OperatorTok"/>
-        </w:rPr>
-        <w:t xml:space="preserve">)</w:t>
-      </w:r>
-      <w:r>
-        <w:rPr>
-          <w:rStyle w:val="NormalTok"/>
-        </w:rPr>
-        <w:t xml:space="preserve"> </w:t>
-      </w:r>
-      <w:r>
-        <w:rPr>
-          <w:rStyle w:val="OperatorTok"/>
-        </w:rPr>
-        <w:t xml:space="preserve">{</w:t>
-      </w:r>
-      <w:r>
-        <w:br/>
-      </w:r>
-      <w:r>
-        <w:rPr>
-          <w:rStyle w:val="NormalTok"/>
-        </w:rPr>
-        <w:t xml:space="preserve">        </w:t>
-      </w:r>
-      <w:r>
-        <w:rPr>
-          <w:rStyle w:val="CommentTok"/>
-        </w:rPr>
-        <w:t xml:space="preserve">// Handle and return processed output</w:t>
-      </w:r>
-      <w:r>
-        <w:br/>
-      </w:r>
-      <w:r>
-        <w:rPr>
-          <w:rStyle w:val="NormalTok"/>
-        </w:rPr>
-        <w:t xml:space="preserve">        </w:t>
-      </w:r>
-      <w:r>
-        <w:rPr>
-          <w:rStyle w:val="KeywordTok"/>
-        </w:rPr>
-        <w:t xml:space="preserve">this</w:t>
-      </w:r>
-      <w:r>
-        <w:rPr>
-          <w:rStyle w:val="OperatorTok"/>
-        </w:rPr>
-        <w:t xml:space="preserve">.</w:t>
-      </w:r>
-      <w:r>
-        <w:rPr>
-          <w:rStyle w:val="FunctionTok"/>
-        </w:rPr>
-        <w:t xml:space="preserve">handleOutput</w:t>
-      </w:r>
-      <w:r>
-        <w:rPr>
-          <w:rStyle w:val="OperatorTok"/>
-        </w:rPr>
-        <w:t xml:space="preserve">(</w:t>
-      </w:r>
-      <w:r>
-        <w:rPr>
-          <w:rStyle w:val="StringTok"/>
-        </w:rPr>
-        <w:t xml:space="preserve">"result"</w:t>
-      </w:r>
-      <w:r>
-        <w:rPr>
-          <w:rStyle w:val="OperatorTok"/>
-        </w:rPr>
-        <w:t xml:space="preserve">,</w:t>
-      </w:r>
-      <w:r>
-        <w:rPr>
-          <w:rStyle w:val="NormalTok"/>
-        </w:rPr>
-        <w:t xml:space="preserve"> </w:t>
-      </w:r>
-      <w:r>
-        <w:rPr>
-          <w:rStyle w:val="StringTok"/>
-        </w:rPr>
-        <w:t xml:space="preserve">"processed string"</w:t>
-      </w:r>
-      <w:r>
-        <w:rPr>
-          <w:rStyle w:val="OperatorTok"/>
-        </w:rPr>
-        <w:t xml:space="preserve">);</w:t>
-      </w:r>
-      <w:r>
-        <w:br/>
-      </w:r>
-      <w:r>
-        <w:rPr>
-          <w:rStyle w:val="NormalTok"/>
-        </w:rPr>
-        <w:t xml:space="preserve">    </w:t>
-      </w:r>
-      <w:r>
-        <w:rPr>
-          <w:rStyle w:val="OperatorTok"/>
-        </w:rPr>
-        <w:t xml:space="preserve">}</w:t>
-      </w:r>
-      <w:r>
-        <w:br/>
-      </w:r>
-      <w:r>
-        <w:rPr>
-          <w:rStyle w:val="OperatorTok"/>
-        </w:rPr>
-        <w:t xml:space="preserve">}</w:t>
-      </w:r>
-    </w:p>
-    <w:p>
-      <w:pPr>
-        <w:pStyle w:val="SourceCode"/>
-      </w:pPr>
-      <w:r>
-        <w:rPr>
-          <w:rStyle w:val="CommentTok"/>
-        </w:rPr>
-        <w:t xml:space="preserve">// Receiver system</w:t>
-      </w:r>
-      <w:r>
-        <w:br/>
-      </w:r>
-      <w:r>
-        <w:rPr>
-          <w:rStyle w:val="KeywordTok"/>
-        </w:rPr>
-        <w:t xml:space="preserve">class</w:t>
-      </w:r>
-      <w:r>
-        <w:rPr>
-          <w:rStyle w:val="NormalTok"/>
-        </w:rPr>
-        <w:t xml:space="preserve"> ReceiveSystem </w:t>
-      </w:r>
-      <w:r>
-        <w:rPr>
-          <w:rStyle w:val="OperatorTok"/>
-        </w:rPr>
-        <w:t xml:space="preserve">{</w:t>
-      </w:r>
-      <w:r>
-        <w:br/>
-      </w:r>
-      <w:r>
-        <w:rPr>
-          <w:rStyle w:val="NormalTok"/>
-        </w:rPr>
-        <w:t xml:space="preserve">    </w:t>
-      </w:r>
-      <w:r>
-        <w:rPr>
-          <w:rStyle w:val="DataTypeTok"/>
-        </w:rPr>
-        <w:t xml:space="preserve">void</w:t>
-      </w:r>
-      <w:r>
-        <w:rPr>
-          <w:rStyle w:val="NormalTok"/>
-        </w:rPr>
-        <w:t xml:space="preserve"> </w:t>
-      </w:r>
-      <w:r>
-        <w:rPr>
-          <w:rStyle w:val="FunctionTok"/>
-        </w:rPr>
-        <w:t xml:space="preserve">main</w:t>
-      </w:r>
-      <w:r>
-        <w:rPr>
-          <w:rStyle w:val="OperatorTok"/>
-        </w:rPr>
-        <w:t xml:space="preserve">()</w:t>
-      </w:r>
-      <w:r>
-        <w:rPr>
-          <w:rStyle w:val="NormalTok"/>
-        </w:rPr>
-        <w:t xml:space="preserve"> </w:t>
-      </w:r>
-      <w:r>
-        <w:rPr>
-          <w:rStyle w:val="OperatorTok"/>
-        </w:rPr>
-        <w:t xml:space="preserve">{</w:t>
-      </w:r>
-      <w:r>
-        <w:br/>
-      </w:r>
-      <w:r>
-        <w:rPr>
-          <w:rStyle w:val="NormalTok"/>
-        </w:rPr>
-        <w:t xml:space="preserve">        </w:t>
-      </w:r>
-      <w:r>
-        <w:rPr>
-          <w:rStyle w:val="CommentTok"/>
-        </w:rPr>
-        <w:t xml:space="preserve">// Accept request from user</w:t>
-      </w:r>
-      <w:r>
-        <w:br/>
-      </w:r>
-      <w:r>
-        <w:rPr>
-          <w:rStyle w:val="NormalTok"/>
-        </w:rPr>
-        <w:t xml:space="preserve">        </w:t>
-      </w:r>
-      <w:r>
-        <w:rPr>
-          <w:rStyle w:val="KeywordTok"/>
-        </w:rPr>
-        <w:t xml:space="preserve">this</w:t>
-      </w:r>
-      <w:r>
-        <w:rPr>
-          <w:rStyle w:val="OperatorTok"/>
-        </w:rPr>
-        <w:t xml:space="preserve">.</w:t>
-      </w:r>
-      <w:r>
-        <w:rPr>
-          <w:rStyle w:val="FunctionTok"/>
-        </w:rPr>
-        <w:t xml:space="preserve">accept</w:t>
-      </w:r>
-      <w:r>
-        <w:rPr>
-          <w:rStyle w:val="OperatorTok"/>
-        </w:rPr>
-        <w:t xml:space="preserve">(</w:t>
-      </w:r>
-      <w:r>
-        <w:rPr>
-          <w:rStyle w:val="StringTok"/>
-        </w:rPr>
-        <w:t xml:space="preserve">"request"</w:t>
-      </w:r>
-      <w:r>
-        <w:rPr>
-          <w:rStyle w:val="OperatorTok"/>
-        </w:rPr>
-        <w:t xml:space="preserve">);</w:t>
-      </w:r>
-      <w:r>
-        <w:br/>
-      </w:r>
-      <w:r>
-        <w:rPr>
-          <w:rStyle w:val="NormalTok"/>
-        </w:rPr>
-        <w:t xml:space="preserve">    </w:t>
-      </w:r>
-      <w:r>
-        <w:rPr>
-          <w:rStyle w:val="OperatorTok"/>
-        </w:rPr>
-        <w:t xml:space="preserve">}</w:t>
-      </w:r>
-      <w:r>
-        <w:br/>
-      </w:r>
-      <w:r>
-        <w:rPr>
-          <w:rStyle w:val="OperatorTok"/>
-        </w:rPr>
-        <w:t xml:space="preserve">}</w:t>
-      </w:r>
-      <w:r>
-        <w:br/>
-      </w:r>
-      <w:r>
-        <w:br/>
-      </w:r>
-      <w:r>
-        <w:rPr>
-          <w:rStyle w:val="CommentTok"/>
-        </w:rPr>
-        <w:t xml:space="preserve">// Message mapping</w:t>
-      </w:r>
-      <w:r>
-        <w:br/>
-      </w:r>
-      <w:r>
-        <w:rPr>
-          <w:rStyle w:val="KeywordTok"/>
-        </w:rPr>
-        <w:t xml:space="preserve">class</w:t>
-      </w:r>
-      <w:r>
-        <w:rPr>
-          <w:rStyle w:val="NormalTok"/>
-        </w:rPr>
-        <w:t xml:space="preserve"> MessageMapper </w:t>
-      </w:r>
-      <w:r>
-        <w:rPr>
-          <w:rStyle w:val="OperatorTok"/>
-        </w:rPr>
-        <w:t xml:space="preserve">{</w:t>
-      </w:r>
-      <w:r>
-        <w:br/>
-      </w:r>
-      <w:r>
-        <w:rPr>
-          <w:rStyle w:val="NormalTok"/>
-        </w:rPr>
-        <w:t xml:space="preserve">    public static </w:t>
-      </w:r>
-      <w:r>
-        <w:rPr>
-          <w:rStyle w:val="OperatorTok"/>
-        </w:rPr>
-        <w:t xml:space="preserve">&lt;</w:t>
-      </w:r>
-      <w:r>
-        <w:rPr>
-          <w:rStyle w:val="NormalTok"/>
-        </w:rPr>
-        <w:t xml:space="preserve">T</w:t>
-      </w:r>
-      <w:r>
-        <w:rPr>
-          <w:rStyle w:val="OperatorTok"/>
-        </w:rPr>
-        <w:t xml:space="preserve">&gt;</w:t>
-      </w:r>
-      <w:r>
-        <w:rPr>
-          <w:rStyle w:val="NormalTok"/>
-        </w:rPr>
-        <w:t xml:space="preserve"> </w:t>
-      </w:r>
-      <w:r>
-        <w:rPr>
-          <w:rStyle w:val="BuiltInTok"/>
-        </w:rPr>
-        <w:t xml:space="preserve">Map</w:t>
-      </w:r>
-      <w:r>
-        <w:rPr>
-          <w:rStyle w:val="OperatorTok"/>
-        </w:rPr>
-        <w:t xml:space="preserve">&lt;</w:t>
-      </w:r>
-      <w:r>
-        <w:rPr>
-          <w:rStyle w:val="BuiltInTok"/>
-        </w:rPr>
-        <w:t xml:space="preserve">String</w:t>
-      </w:r>
-      <w:r>
-        <w:rPr>
-          <w:rStyle w:val="OperatorTok"/>
-        </w:rPr>
-        <w:t xml:space="preserve">,</w:t>
-      </w:r>
-      <w:r>
-        <w:rPr>
-          <w:rStyle w:val="NormalTok"/>
-        </w:rPr>
-        <w:t xml:space="preserve"> </w:t>
-      </w:r>
-      <w:r>
-        <w:rPr>
-          <w:rStyle w:val="BuiltInTok"/>
-        </w:rPr>
-        <w:t xml:space="preserve">Object</w:t>
-      </w:r>
-      <w:r>
-        <w:rPr>
-          <w:rStyle w:val="OperatorTok"/>
-        </w:rPr>
-        <w:t xml:space="preserve">&gt;</w:t>
-      </w:r>
-      <w:r>
-        <w:rPr>
-          <w:rStyle w:val="NormalTok"/>
-        </w:rPr>
-        <w:t xml:space="preserve"> </w:t>
-      </w:r>
-      <w:r>
-        <w:rPr>
-          <w:rStyle w:val="FunctionTok"/>
-        </w:rPr>
-        <w:t xml:space="preserve">mapTo</w:t>
-      </w:r>
-      <w:r>
-        <w:rPr>
-          <w:rStyle w:val="OperatorTok"/>
-        </w:rPr>
-        <w:t xml:space="preserve">(</w:t>
-      </w:r>
-      <w:r>
-        <w:rPr>
-          <w:rStyle w:val="NormalTok"/>
-        </w:rPr>
-        <w:t xml:space="preserve">object obj</w:t>
-      </w:r>
-      <w:r>
-        <w:rPr>
-          <w:rStyle w:val="OperatorTok"/>
-        </w:rPr>
-        <w:t xml:space="preserve">)</w:t>
-      </w:r>
-      <w:r>
-        <w:rPr>
-          <w:rStyle w:val="NormalTok"/>
-        </w:rPr>
-        <w:t xml:space="preserve"> </w:t>
-      </w:r>
-      <w:r>
-        <w:rPr>
-          <w:rStyle w:val="OperatorTok"/>
-        </w:rPr>
-        <w:t xml:space="preserve">{</w:t>
-      </w:r>
-      <w:r>
-        <w:br/>
-      </w:r>
-      <w:r>
-        <w:rPr>
-          <w:rStyle w:val="NormalTok"/>
-        </w:rPr>
-        <w:t xml:space="preserve">        </w:t>
-      </w:r>
-      <w:r>
-        <w:rPr>
-          <w:rStyle w:val="ControlFlowTok"/>
-        </w:rPr>
-        <w:t xml:space="preserve">return</w:t>
-      </w:r>
-      <w:r>
-        <w:rPr>
-          <w:rStyle w:val="NormalTok"/>
-        </w:rPr>
-        <w:t xml:space="preserve"> </w:t>
-      </w:r>
-      <w:r>
-        <w:rPr>
-          <w:rStyle w:val="KeywordTok"/>
-        </w:rPr>
-        <w:t xml:space="preserve">new</w:t>
-      </w:r>
-      <w:r>
-        <w:rPr>
-          <w:rStyle w:val="NormalTok"/>
-        </w:rPr>
-        <w:t xml:space="preserve"> </w:t>
-      </w:r>
-      <w:r>
-        <w:rPr>
-          <w:rStyle w:val="BuiltInTok"/>
-        </w:rPr>
-        <w:t xml:space="preserve">HashMap</w:t>
-      </w:r>
-      <w:r>
-        <w:rPr>
-          <w:rStyle w:val="OperatorTok"/>
-        </w:rPr>
-        <w:t xml:space="preserve">&lt;&gt;();</w:t>
-      </w:r>
-      <w:r>
-        <w:br/>
-      </w:r>
-      <w:r>
-        <w:rPr>
-          <w:rStyle w:val="NormalTok"/>
-        </w:rPr>
-        <w:t xml:space="preserve">    </w:t>
-      </w:r>
-      <w:r>
-        <w:rPr>
-          <w:rStyle w:val="OperatorTok"/>
-        </w:rPr>
-        <w:t xml:space="preserve">}</w:t>
-      </w:r>
-      <w:r>
-        <w:br/>
-      </w:r>
-      <w:r>
-        <w:rPr>
-          <w:rStyle w:val="OperatorTok"/>
-        </w:rPr>
-        <w:t xml:space="preserve">}</w:t>
-      </w:r>
-    </w:p>
-    <w:bookmarkEnd w:id="26"/>
-    <w:bookmarkStart w:id="27" w:name="error-handling"/>
-    <w:p>
-      <w:pPr>
-        <w:pStyle w:val="Heading3"/>
-      </w:pPr>
-      <w:r>
-        <w:t xml:space="preserve">8. Error handling</w:t>
-      </w:r>
-    </w:p>
-    <w:p>
-      <w:pPr>
-        <w:pStyle w:val="FirstParagraph"/>
-      </w:pPr>
-      <w:r>
-        <w:t xml:space="preserve">Errors are logged and retried with specific messages for traceability.</w:t>
-      </w:r>
-    </w:p>
-    <w:p>
-      <w:r>
-        <w:pict>
-          <v:rect style="width:0;height:1.5pt" o:hralign="center" o:hrstd="t" o:hr="t"/>
-        </w:pict>
+        <w:t xml:space="preserve">Invalid message</w:t>
+      </w:r>
+      <w:r>
+        <w:t xml:space="preserve">: Log the error and handle messages via the xslmap processor.</w:t>
       </w:r>
     </w:p>
     <w:bookmarkEnd w:id="27"/>
     <w:bookmarkStart w:id="28" w:name="high-level-process-flow-diagram"/>
     <w:p>
       <w:pPr>
-        <w:pStyle w:val="Heading3"/>
-      </w:pPr>
-      <w:r>
-        <w:t xml:space="preserve">High-Level Process Flow Diagram</w:t>
+        <w:pStyle w:val="Heading2"/>
+      </w:pPr>
+      <w:r>
+        <w:t xml:space="preserve">9. High-Level Process Flow Diagram</w:t>
+      </w:r>
+    </w:p>
+    <w:p>
+      <w:pPr>
+        <w:pStyle w:val="SourceCode"/>
+      </w:pPr>
+      <w:r>
+        <w:rPr>
+          <w:rStyle w:val="VerbatimChar"/>
+        </w:rPr>
+        <w:t xml:space="preserve">graph TD</w:t>
+      </w:r>
+      <w:r>
+        <w:br/>
+      </w:r>
+      <w:r>
+        <w:rPr>
+          <w:rStyle w:val="VerbatimChar"/>
+        </w:rPr>
+        <w:t xml:space="preserve">    SenderSystem --&gt;|Request| CPI</w:t>
+      </w:r>
+      <w:r>
+        <w:br/>
+      </w:r>
+      <w:r>
+        <w:rPr>
+          <w:rStyle w:val="VerbatimChar"/>
+        </w:rPr>
+        <w:t xml:space="preserve">    CPI --&gt;|Processed Output| ReceiverSystem</w:t>
+      </w:r>
+    </w:p>
+    <w:bookmarkEnd w:id="28"/>
+    <w:bookmarkStart w:id="29" w:name="references"/>
+    <w:p>
+      <w:pPr>
+        <w:pStyle w:val="Heading2"/>
+      </w:pPr>
+      <w:r>
+        <w:t xml:space="preserve">References</w:t>
       </w:r>
     </w:p>
     <w:p>
@@ -1029,10 +348,164 @@
         <w:pStyle w:val="FirstParagraph"/>
       </w:pPr>
       <w:r>
-        <w:t xml:space="preserve">SenderSystem –&gt;|Request| processor –&gt;|Processed Output| ReceiverSystem</w:t>
-      </w:r>
-    </w:p>
-    <w:bookmarkEnd w:id="28"/>
+        <w:t xml:space="preserve">{</w:t>
+      </w:r>
+      <w:r>
+        <w:t xml:space="preserve"> </w:t>
+      </w:r>
+      <w:r>
+        <w:t xml:space="preserve">“</w:t>
+      </w:r>
+      <w:r>
+        <w:t xml:space="preserve">flowname</w:t>
+      </w:r>
+      <w:r>
+        <w:t xml:space="preserve">”</w:t>
+      </w:r>
+      <w:r>
+        <w:t xml:space="preserve">:</w:t>
+      </w:r>
+      <w:r>
+        <w:t xml:space="preserve"> </w:t>
+      </w:r>
+      <w:r>
+        <w:t xml:space="preserve">“</w:t>
+      </w:r>
+      <w:r>
+        <w:t xml:space="preserve">Calling</w:t>
+      </w:r>
+      <w:r>
+        <w:t xml:space="preserve">”</w:t>
+      </w:r>
+      <w:r>
+        <w:t xml:space="preserve">,</w:t>
+      </w:r>
+      <w:r>
+        <w:t xml:space="preserve"> </w:t>
+      </w:r>
+      <w:r>
+        <w:t xml:space="preserve">“</w:t>
+      </w:r>
+      <w:r>
+        <w:t xml:space="preserve">senders</w:t>
+      </w:r>
+      <w:r>
+        <w:t xml:space="preserve">”</w:t>
+      </w:r>
+      <w:r>
+        <w:t xml:space="preserve">: [],</w:t>
+      </w:r>
+      <w:r>
+        <w:t xml:space="preserve"> </w:t>
+      </w:r>
+      <w:r>
+        <w:t xml:space="preserve">“</w:t>
+      </w:r>
+      <w:r>
+        <w:t xml:space="preserve">receivers</w:t>
+      </w:r>
+      <w:r>
+        <w:t xml:space="preserve">”</w:t>
+      </w:r>
+      <w:r>
+        <w:t xml:space="preserve">: [],</w:t>
+      </w:r>
+      <w:r>
+        <w:t xml:space="preserve"> </w:t>
+      </w:r>
+      <w:r>
+        <w:t xml:space="preserve">“</w:t>
+      </w:r>
+      <w:r>
+        <w:t xml:space="preserve">adapters</w:t>
+      </w:r>
+      <w:r>
+        <w:t xml:space="preserve">”</w:t>
+      </w:r>
+      <w:r>
+        <w:t xml:space="preserve">: [],</w:t>
+      </w:r>
+      <w:r>
+        <w:t xml:space="preserve"> </w:t>
+      </w:r>
+      <w:r>
+        <w:t xml:space="preserve">“</w:t>
+      </w:r>
+      <w:r>
+        <w:t xml:space="preserve">scripts</w:t>
+      </w:r>
+      <w:r>
+        <w:t xml:space="preserve">”</w:t>
+      </w:r>
+      <w:r>
+        <w:t xml:space="preserve">: [],</w:t>
+      </w:r>
+      <w:r>
+        <w:t xml:space="preserve"> </w:t>
+      </w:r>
+      <w:r>
+        <w:t xml:space="preserve">“</w:t>
+      </w:r>
+      <w:r>
+        <w:t xml:space="preserve">mappings</w:t>
+      </w:r>
+      <w:r>
+        <w:t xml:space="preserve">”</w:t>
+      </w:r>
+      <w:r>
+        <w:t xml:space="preserve">: [],</w:t>
+      </w:r>
+      <w:r>
+        <w:t xml:space="preserve"> </w:t>
+      </w:r>
+      <w:r>
+        <w:t xml:space="preserve">“</w:t>
+      </w:r>
+      <w:r>
+        <w:t xml:space="preserve">steps</w:t>
+      </w:r>
+      <w:r>
+        <w:t xml:space="preserve">”</w:t>
+      </w:r>
+      <w:r>
+        <w:t xml:space="preserve">: [],</w:t>
+      </w:r>
+      <w:r>
+        <w:t xml:space="preserve"> </w:t>
+      </w:r>
+      <w:r>
+        <w:t xml:space="preserve">“</w:t>
+      </w:r>
+      <w:r>
+        <w:t xml:space="preserve">error</w:t>
+      </w:r>
+      <w:r>
+        <w:t xml:space="preserve">”</w:t>
+      </w:r>
+      <w:r>
+        <w:t xml:space="preserve">: “XML parse error: [Errno 2] No such file or directory:</w:t>
+      </w:r>
+      <w:r>
+        <w:t xml:space="preserve"> </w:t>
+      </w:r>
+      <w:r>
+        <w:t xml:space="preserve">‘</w:t>
+      </w:r>
+      <w:r>
+        <w:t xml:space="preserve">cpi-artifacts/Practice/Calling_other_iflow_using_http_adapter/src/main/resources/scenarioflows/integrationflow/Calling</w:t>
+      </w:r>
+      <w:r>
+        <w:t xml:space="preserve">’</w:t>
+      </w:r>
+      <w:r>
+        <w:t xml:space="preserve"> </w:t>
+      </w:r>
+      <w:r>
+        <w:t xml:space="preserve">}</w:t>
+      </w:r>
+    </w:p>
+    <w:bookmarkEnd w:id="29"/>
+    <w:bookmarkEnd w:id="30"/>
     <w:sectPr/>
   </w:body>
 </w:document>
@@ -1215,91 +688,6 @@
       </w:pPr>
     </w:lvl>
   </w:abstractNum>
-  <w:abstractNum w:abstractNumId="99411">
-    <w:nsid w:val="A99411"/>
-    <w:multiLevelType w:val="multilevel"/>
-    <w:lvl w:ilvl="0">
-      <w:start w:val="1"/>
-      <w:numFmt w:val="decimal"/>
-      <w:lvlText w:val="%1."/>
-      <w:lvlJc w:val="left"/>
-      <w:pPr>
-        <w:ind w:left="720" w:hanging="480"/>
-      </w:pPr>
-    </w:lvl>
-    <w:lvl w:ilvl="1">
-      <w:start w:val="1"/>
-      <w:numFmt w:val="decimal"/>
-      <w:lvlText w:val="%2."/>
-      <w:lvlJc w:val="left"/>
-      <w:pPr>
-        <w:ind w:left="1440" w:hanging="480"/>
-      </w:pPr>
-    </w:lvl>
-    <w:lvl w:ilvl="2">
-      <w:start w:val="1"/>
-      <w:numFmt w:val="decimal"/>
-      <w:lvlText w:val="%3."/>
-      <w:lvlJc w:val="left"/>
-      <w:pPr>
-        <w:ind w:left="2160" w:hanging="480"/>
-      </w:pPr>
-    </w:lvl>
-    <w:lvl w:ilvl="3">
-      <w:start w:val="1"/>
-      <w:numFmt w:val="decimal"/>
-      <w:lvlText w:val="%4."/>
-      <w:lvlJc w:val="left"/>
-      <w:pPr>
-        <w:ind w:left="2880" w:hanging="480"/>
-      </w:pPr>
-    </w:lvl>
-    <w:lvl w:ilvl="4">
-      <w:start w:val="1"/>
-      <w:numFmt w:val="decimal"/>
-      <w:lvlText w:val="%5."/>
-      <w:lvlJc w:val="left"/>
-      <w:pPr>
-        <w:ind w:left="3600" w:hanging="480"/>
-      </w:pPr>
-    </w:lvl>
-    <w:lvl w:ilvl="5">
-      <w:start w:val="1"/>
-      <w:numFmt w:val="decimal"/>
-      <w:lvlText w:val="%6."/>
-      <w:lvlJc w:val="left"/>
-      <w:pPr>
-        <w:ind w:left="4320" w:hanging="480"/>
-      </w:pPr>
-    </w:lvl>
-    <w:lvl w:ilvl="6">
-      <w:start w:val="1"/>
-      <w:numFmt w:val="decimal"/>
-      <w:lvlText w:val="%7."/>
-      <w:lvlJc w:val="left"/>
-      <w:pPr>
-        <w:ind w:left="5040" w:hanging="480"/>
-      </w:pPr>
-    </w:lvl>
-    <w:lvl w:ilvl="7">
-      <w:start w:val="1"/>
-      <w:numFmt w:val="decimal"/>
-      <w:lvlText w:val="%8."/>
-      <w:lvlJc w:val="left"/>
-      <w:pPr>
-        <w:ind w:left="5760" w:hanging="480"/>
-      </w:pPr>
-    </w:lvl>
-    <w:lvl w:ilvl="8">
-      <w:start w:val="1"/>
-      <w:numFmt w:val="decimal"/>
-      <w:lvlText w:val="%9."/>
-      <w:lvlJc w:val="left"/>
-      <w:pPr>
-        <w:ind w:left="6480" w:hanging="480"/>
-      </w:pPr>
-    </w:lvl>
-  </w:abstractNum>
   <w:num w:numId="1000">
     <w:abstractNumId w:val="990"/>
   </w:num>
@@ -1307,36 +695,6 @@
     <w:abstractNumId w:val="991"/>
   </w:num>
   <w:num w:numId="1002">
-    <w:abstractNumId w:val="99411"/>
-    <w:lvlOverride w:ilvl="0">
-      <w:startOverride w:val="1"/>
-    </w:lvlOverride>
-    <w:lvlOverride w:ilvl="1">
-      <w:startOverride w:val="1"/>
-    </w:lvlOverride>
-    <w:lvlOverride w:ilvl="2">
-      <w:startOverride w:val="1"/>
-    </w:lvlOverride>
-    <w:lvlOverride w:ilvl="3">
-      <w:startOverride w:val="1"/>
-    </w:lvlOverride>
-    <w:lvlOverride w:ilvl="4">
-      <w:startOverride w:val="1"/>
-    </w:lvlOverride>
-    <w:lvlOverride w:ilvl="5">
-      <w:startOverride w:val="1"/>
-    </w:lvlOverride>
-    <w:lvlOverride w:ilvl="6">
-      <w:startOverride w:val="1"/>
-    </w:lvlOverride>
-    <w:lvlOverride w:ilvl="7">
-      <w:startOverride w:val="1"/>
-    </w:lvlOverride>
-    <w:lvlOverride w:ilvl="8">
-      <w:startOverride w:val="1"/>
-    </w:lvlOverride>
-  </w:num>
-  <w:num w:numId="1003">
     <w:abstractNumId w:val="991"/>
   </w:num>
 </w:numbering>

</xml_diff>